<commit_message>
Phase 1: data cleaning, flight phases, battery chains, locked train/test split
</commit_message>
<xml_diff>
--- a/docs/EnduroSense_Project_Plan.docx
+++ b/docs/EnduroSense_Project_Plan.docx
@@ -1404,7 +1404,7 @@
         <w:t xml:space="preserve">Energy use.</w:t>
       </w:r>
       <w:r>
-        <w:t xml:space="preserve"> A typical mission lasts about 3 minutes and uses about 21 Wh (a fifth of the battery): about 50% in cruise, 23% climbing and 18% descending. Cruise draws about 510 W and hovering about 475 W.</w:t>
+        <w:t xml:space="preserve"> A typical mission lasts about 3 minutes and uses about 21 Wh (a fifth of the battery): about 50% in cruise, 17% climbing and 22% descending (descents are slow, so they last longer). Cruise draws about 510 W and hovering about 475 W.</w:t>
       </w:r>
     </w:p>
     <w:p>
@@ -1451,17 +1451,17 @@
           <w:b/>
           <w:bCs/>
         </w:rPr>
-        <w:t xml:space="preserve">62 same-battery chains</w:t>
-      </w:r>
-      <w:r>
-        <w:t xml:space="preserve"> (168 flights), </w:t>
-      </w:r>
-      <w:r>
-        <w:rPr>
-          <w:b/>
-          <w:bCs/>
-        </w:rPr>
-        <w:t xml:space="preserve">25 of which run from nearly full to near reserve</w:t>
+        <w:t xml:space="preserve">68 multi-flight chains</w:t>
+      </w:r>
+      <w:r>
+        <w:t xml:space="preserve"> (176 flights), and </w:t>
+      </w:r>
+      <w:r>
+        <w:rPr>
+          <w:b/>
+          <w:bCs/>
+        </w:rPr>
+        <w:t xml:space="preserve">60 chains end near the reserve</w:t>
       </w:r>
       <w:r>
         <w:t xml:space="preserve">, using up to 88 Wh. This gives Model A </w:t>
@@ -3481,7 +3481,7 @@
                 <w:sz w:val="19"/>
                 <w:szCs w:val="19"/>
               </w:rPr>
-              <w:t xml:space="preserve">Only 25 chains reach the reserve, so Model A has limited labels</w:t>
+              <w:t xml:space="preserve">Only 60 chains end near the reserve, so Model A has limited labels</w:t>
             </w:r>
           </w:p>
         </w:tc>
@@ -4005,15 +4005,21 @@
           <w:sz w:val="17"/>
           <w:szCs w:val="17"/>
         </w:rPr>
-        <w:t xml:space="preserve">[1]	</w:t>
-      </w:r>
+        <w:t xml:space="preserve">[1]	Rodrigues, T. A., et al. (2021). In-flight positional and energy use data set of a DJI Matrice 100 quadcopter for small package delivery. Scientific Data. Dataset: doi.org/10.1184/R1/12683453</w:t>
+      </w:r>
+    </w:p>
+    <w:p>
+      <w:pPr>
+        <w:spacing w:after="30" w:line="240"/>
+        <w:ind w:left="360" w:hanging="360"/>
+      </w:pPr>
       <w:r>
         <w:rPr>
           <w:color w:val="52514E"/>
           <w:sz w:val="17"/>
           <w:szCs w:val="17"/>
         </w:rPr>
-        <w:t xml:space="preserve">Rodrigues, T. A., et al. (2021). In-flight positional and energy use data set of a DJI Matrice 100 quadcopter for small package delivery. Scientific Data. Dataset: doi.org/10.1184/R1/12683453</w:t>
+        <w:t xml:space="preserve">[2]	Chen, T., &amp; Guestrin, C. (2016). XGBoost: A scalable tree boosting system. KDD.</w:t>
       </w:r>
     </w:p>
     <w:p>
@@ -4027,59 +4033,21 @@
           <w:sz w:val="17"/>
           <w:szCs w:val="17"/>
         </w:rPr>
-        <w:t xml:space="preserve">[2]	</w:t>
-      </w:r>
+        <w:t xml:space="preserve">[3]	Lakshminarayanan, B., Pritzel, A., &amp; Blundell, C. (2017). Simple and scalable predictive uncertainty estimation using deep ensembles. NeurIPS.</w:t>
+      </w:r>
+    </w:p>
+    <w:p>
+      <w:pPr>
+        <w:spacing w:after="30" w:line="240"/>
+        <w:ind w:left="360" w:hanging="360"/>
+      </w:pPr>
       <w:r>
         <w:rPr>
           <w:color w:val="52514E"/>
           <w:sz w:val="17"/>
           <w:szCs w:val="17"/>
         </w:rPr>
-        <w:t xml:space="preserve">Chen, T., &amp; Guestrin, C. (2016). XGBoost: A scalable tree boosting system. KDD.</w:t>
-      </w:r>
-    </w:p>
-    <w:p>
-      <w:pPr>
-        <w:spacing w:after="30" w:line="240"/>
-        <w:ind w:left="360" w:hanging="360"/>
-      </w:pPr>
-      <w:r>
-        <w:rPr>
-          <w:color w:val="52514E"/>
-          <w:sz w:val="17"/>
-          <w:szCs w:val="17"/>
-        </w:rPr>
-        <w:t xml:space="preserve">[3]	</w:t>
-      </w:r>
-      <w:r>
-        <w:rPr>
-          <w:color w:val="52514E"/>
-          <w:sz w:val="17"/>
-          <w:szCs w:val="17"/>
-        </w:rPr>
-        <w:t xml:space="preserve">Lakshminarayanan, B., Pritzel, A., &amp; Blundell, C. (2017). Simple and scalable predictive uncertainty estimation using deep ensembles. NeurIPS.</w:t>
-      </w:r>
-    </w:p>
-    <w:p>
-      <w:pPr>
-        <w:spacing w:after="30" w:line="240"/>
-        <w:ind w:left="360" w:hanging="360"/>
-      </w:pPr>
-      <w:r>
-        <w:rPr>
-          <w:color w:val="52514E"/>
-          <w:sz w:val="17"/>
-          <w:szCs w:val="17"/>
-        </w:rPr>
-        <w:t xml:space="preserve">[4]	</w:t>
-      </w:r>
-      <w:r>
-        <w:rPr>
-          <w:color w:val="52514E"/>
-          <w:sz w:val="17"/>
-          <w:szCs w:val="17"/>
-        </w:rPr>
-        <w:t xml:space="preserve">Angelopoulos, A. N., &amp; Bates, S. (2021). A gentle introduction to conformal prediction and distribution-free uncertainty quantification. arXiv:2107.07511.</w:t>
+        <w:t xml:space="preserve">[4]	Angelopoulos, A. N., &amp; Bates, S. (2021). A gentle introduction to conformal prediction and distribution-free uncertainty quantification. arXiv:2107.07511.</w:t>
       </w:r>
     </w:p>
     <w:sectPr>

</xml_diff>

<commit_message>
Verification pass: fix time-ordering bug, correct 4 start times, rebuild split as v2
</commit_message>
<xml_diff>
--- a/docs/EnduroSense_Project_Plan.docx
+++ b/docs/EnduroSense_Project_Plan.docx
@@ -1451,10 +1451,10 @@
           <w:b/>
           <w:bCs/>
         </w:rPr>
-        <w:t xml:space="preserve">68 multi-flight chains</w:t>
-      </w:r>
-      <w:r>
-        <w:t xml:space="preserve"> (176 flights), and </w:t>
+        <w:t xml:space="preserve">71 multi-flight chains</w:t>
+      </w:r>
+      <w:r>
+        <w:t xml:space="preserve"> (190 flights), and </w:t>
       </w:r>
       <w:r>
         <w:rPr>

</xml_diff>